<commit_message>
release: 0.4.0 structural decoupling + sticky form UX improvements
</commit_message>
<xml_diff>
--- a/src/sar/report_templates/c4_chain_report.docx
+++ b/src/sar/report_templates/c4_chain_report.docx
@@ -65,7 +65,7 @@
     </w:p>
     <w:p>
       <w:r>
-        <w:t>Figura 1 — Cadena C1 → C2 → C3 → C4</w:t>
+        <w:t>Figura 1 — Cadena {{ c1_label }} → {{ c2_label }} → {{ c3_label }} → {{ c4_label }}</w:t>
       </w:r>
     </w:p>
     <w:p>
@@ -143,7 +143,7 @@
           </w:tcPr>
           <w:p>
             <w:r>
-              <w:t>C1</w:t>
+              <w:t>{{ c1_label }}</w:t>
             </w:r>
           </w:p>
         </w:tc>
@@ -185,7 +185,7 @@
           </w:tcPr>
           <w:p>
             <w:r>
-              <w:t>C2</w:t>
+              <w:t>{{ c2_label }}</w:t>
             </w:r>
           </w:p>
         </w:tc>
@@ -227,7 +227,7 @@
           </w:tcPr>
           <w:p>
             <w:r>
-              <w:t>C3</w:t>
+              <w:t>{{ c3_label }}</w:t>
             </w:r>
           </w:p>
         </w:tc>
@@ -269,7 +269,7 @@
           </w:tcPr>
           <w:p>
             <w:r>
-              <w:t>C4</w:t>
+              <w:t>{{ c4_label }}</w:t>
             </w:r>
           </w:p>
         </w:tc>
@@ -311,7 +311,7 @@
         <w:pStyle w:val="Heading2"/>
       </w:pPr>
       <w:r>
-        <w:t>3. Componentes de la aplicación (C3)</w:t>
+        <w:t>3. Componentes ({{ c3_label }})</w:t>
       </w:r>
     </w:p>
     <w:p>
@@ -335,7 +335,7 @@
         <w:pStyle w:val="Heading2"/>
       </w:pPr>
       <w:r>
-        <w:t>4. Runtimes del componente (C4)</w:t>
+        <w:t>4. {{ c4_label }}s del componente</w:t>
       </w:r>
     </w:p>
     <w:p>
@@ -367,7 +367,7 @@
         <w:pStyle w:val="Heading3"/>
       </w:pPr>
       <w:r>
-        <w:t>Issues — C1</w:t>
+        <w:t>Issues — {{ c1_label }}</w:t>
       </w:r>
     </w:p>
     <w:p>
@@ -400,7 +400,7 @@
         <w:pStyle w:val="Heading3"/>
       </w:pPr>
       <w:r>
-        <w:t>Issues — C2</w:t>
+        <w:t>Issues — {{ c2_label }}</w:t>
       </w:r>
     </w:p>
     <w:p>
@@ -433,7 +433,7 @@
         <w:pStyle w:val="Heading3"/>
       </w:pPr>
       <w:r>
-        <w:t>Issues — C3</w:t>
+        <w:t>Issues — {{ c3_label }}</w:t>
       </w:r>
     </w:p>
     <w:p>
@@ -466,7 +466,7 @@
         <w:pStyle w:val="Heading3"/>
       </w:pPr>
       <w:r>
-        <w:t>Issues — C4</w:t>
+        <w:t>Issues — {{ c4_label }}</w:t>
       </w:r>
     </w:p>
     <w:p>

</xml_diff>

<commit_message>
feat: add schema versioning, C4 reports, RBAC, dynamic labels and validation improvements
</commit_message>
<xml_diff>
--- a/src/sar/report_templates/c4_chain_report.docx
+++ b/src/sar/report_templates/c4_chain_report.docx
@@ -7,7 +7,7 @@
         <w:pStyle w:val="Heading1"/>
       </w:pPr>
       <w:r>
-        <w:t>Informe SAR — {{ c4.human_id }}</w:t>
+        <w:t>Informe SAR — {{ c4.id }}</w:t>
       </w:r>
     </w:p>
     <w:p>
@@ -153,7 +153,7 @@
           </w:tcPr>
           <w:p>
             <w:r>
-              <w:t>{{ c1.human_id }}</w:t>
+              <w:t>{{ c1.id }}</w:t>
             </w:r>
           </w:p>
         </w:tc>
@@ -195,7 +195,7 @@
           </w:tcPr>
           <w:p>
             <w:r>
-              <w:t>{{ c2.human_id }}</w:t>
+              <w:t>{{ c2.id }}</w:t>
             </w:r>
           </w:p>
         </w:tc>
@@ -237,7 +237,7 @@
           </w:tcPr>
           <w:p>
             <w:r>
-              <w:t>{{ c3.human_id }}</w:t>
+              <w:t>{{ c3.id }}</w:t>
             </w:r>
           </w:p>
         </w:tc>
@@ -279,7 +279,7 @@
           </w:tcPr>
           <w:p>
             <w:r>
-              <w:t>{{ c4.human_id }}</w:t>
+              <w:t>{{ c4.id }}</w:t>
             </w:r>
           </w:p>
         </w:tc>
@@ -321,7 +321,7 @@
     </w:p>
     <w:p>
       <w:r>
-        <w:t>• {{ c.human_id }} — {{ c.name }} ({{ c.status }})</w:t>
+        <w:t>• {{ c.id }} — {{ c.name }} ({{ c.status }})</w:t>
       </w:r>
     </w:p>
     <w:p>
@@ -345,7 +345,7 @@
     </w:p>
     <w:p>
       <w:r>
-        <w:t>• {{ r.human_id }} — {{ r.name }} ({{ r.status }})</w:t>
+        <w:t>• {{ r.id }} — {{ r.name }} ({{ r.status }})</w:t>
       </w:r>
     </w:p>
     <w:p>

</xml_diff>